<commit_message>
KAM L2: add the Content Hub Helicopter openings (R11-20)
The KAM build reworked openings for L1 only (withHelicopter); L2 reused the
standard OPC factory directly, so KAM L2 played the standard property-level
openings, not the reworked cross-regional ones. Add KAM_L2_OPENINGS (R11-20,
from the GAME LEVEL 2 Content Hub doc) + a withKamL2 helper that swaps the
opening AM line + partner first reply and stamps the closing; the L2 KAM
registration now calls withKamL2. Fixed the Content Hub R14 "Hi Ren" (AM
greeting himself) typo to "Hi Anton". Regenerated KAM legal packs 9-10.
Verified: L2 openings match the Content Hub, all L2 optimal paths still 3
stars (opening is display copy, not graded).
</commit_message>
<xml_diff>
--- a/docs/review-packs/Legal Review Pack 10 - Cross-Regional (KAM) - Openings and Closings R11-20.docx
+++ b/docs/review-packs/Legal Review Pack 10 - Cross-Regional (KAM) - Openings and Closings R11-20.docx
@@ -233,7 +233,7 @@
           <w:sz w:val="20"/>
           <w:szCs w:val="20"/>
         </w:rPr>
-        <w:t xml:space="preserve">“Hi Liam, thanks for taking the time to reconnect. Following up on our last conversation, I wanted to review your latest performance. Do you have a quick moment to look into it together?”</w:t>
+        <w:t xml:space="preserve">“Hi Liam, thanks for reconnecting today. Following up on our initial test with country rates, I wanted to review your broader portfolio performance and address some persistent visibility bottlenecks affecting Royal Crest Hotel. Do you have a moment to review the high-level metrics together?”</w:t>
       </w:r>
     </w:p>
     <w:p>
@@ -264,7 +264,7 @@
           <w:sz w:val="20"/>
           <w:szCs w:val="20"/>
         </w:rPr>
-        <w:t xml:space="preserve">“Let's dive in, Anya. We're keeping our prices the same to protect our profits, but I'll admit revenue is lower than I'd like. What's your data showing?”</w:t>
+        <w:t xml:space="preserve">“Let's dive in, Anya. We are keeping our prices the same to protect our profits, but I admit that revenue is lower than I would like. What is your data showing?”</w:t>
       </w:r>
     </w:p>
     <w:p>
@@ -373,7 +373,7 @@
           <w:sz w:val="20"/>
           <w:szCs w:val="20"/>
         </w:rPr>
-        <w:t xml:space="preserve">“Hi Chloe, thanks for jumping on today. I wanted to catch up on how the group is pacing for the upcoming quarter. Do you have time to look at your performance together?”</w:t>
+        <w:t xml:space="preserve">“Hi Chloe, thanks for reconnecting today. Following up on the optimized family rates and international rates we implemented across your portfolio, overall group demand is holding steady. However, Silver Horizon Resort is still experiencing a bottleneck in conversion compared to your broader portfolio. Do you have a quick moment to look into what's driving this?”</w:t>
       </w:r>
     </w:p>
     <w:p>
@@ -513,7 +513,7 @@
           <w:sz w:val="20"/>
           <w:szCs w:val="20"/>
         </w:rPr>
-        <w:t xml:space="preserve">“Good morning, Camila. Great to connect with you again. How are things going across your properties?”</w:t>
+        <w:t xml:space="preserve">“Good morning, Camila. From a group perspective, traveler interest across the resorts on the western coast remains high. However, Ocean View Resort is still showing a gap leading to a noticeable drop in conversion. I wanted to bring this to your attention so we can explore targeted tools to address it without impacting your broader brand strategy.”</w:t>
       </w:r>
     </w:p>
     <w:p>
@@ -544,7 +544,7 @@
           <w:sz w:val="20"/>
           <w:szCs w:val="20"/>
         </w:rPr>
-        <w:t xml:space="preserve">“Good morning, Javier. We're doing alright, thank you. We've been focusing a lot on our guest welcome experience lately - making sure our families and long-term guests feel completely at home. Though, to be honest, my team is still a bit anxious about our pace for the upcoming months. I was hoping the numbers on your platform are fine after our previous trial?”</w:t>
+        <w:t xml:space="preserve">“Thanks for bringing this to my attention, Javier. We've been focusing a lot on our guest welcome experience lately... You know, making sure our families and long-term guests feel completely at home. Though, to be completely transparent with you, my team is still a bit anxious about our pace for the upcoming months.”</w:t>
       </w:r>
     </w:p>
     <w:p>
@@ -653,7 +653,7 @@
           <w:sz w:val="20"/>
           <w:szCs w:val="20"/>
         </w:rPr>
-        <w:t xml:space="preserve">“Good morning, Anton. Nice to speak with you again. I've been analysing your performance for the next 90 days to spot a couple of opportunities. Do you have a moment to look at the data?”</w:t>
+        <w:t xml:space="preserve">“Hi Anton, thanks for joining our quarterly portfolio review. Before we dive into macro growth, I want to address Riverside Boutique Hotel's drop in conversion. Can we discuss this property before diving into the overall performance?”</w:t>
       </w:r>
     </w:p>
     <w:p>
@@ -684,7 +684,7 @@
           <w:sz w:val="20"/>
           <w:szCs w:val="20"/>
         </w:rPr>
-        <w:t xml:space="preserve">“Morning, Ren. Yes, keep it brief - we're right in the middle of preparations for some major events. As you know, my focus is protecting our revenue and maintaining brand standards. What's the situation?”</w:t>
+        <w:t xml:space="preserve">“Hi Ren. Yes, keep it brief. We are right in the middle of preparations for some major events. As you know, my focus is protecting our revenue and maintaining brand standards. What's the situation?”</w:t>
       </w:r>
     </w:p>
     <w:p>
@@ -793,7 +793,7 @@
           <w:sz w:val="20"/>
           <w:szCs w:val="20"/>
         </w:rPr>
-        <w:t xml:space="preserve">“Good afternoon, Sophia. Thanks for taking the time. Following up on your targeted occupancy setups, I've looked at your performance for the next few months. Do you have a moment to go through it together?”</w:t>
+        <w:t xml:space="preserve">“Good afternoon Sophia, I've analyzed your regional portfolio performance and zoomed into properties that are losing out on conversion. While our local account manager confirmed that the family rate configuration was successfully enabled at Emerald Peak Lodge, it still needs your attention based on the trends we captured.”</w:t>
       </w:r>
     </w:p>
     <w:p>
@@ -824,7 +824,7 @@
           <w:sz w:val="20"/>
           <w:szCs w:val="20"/>
         </w:rPr>
-        <w:t xml:space="preserve">“Good afternoon, Mei. Yes, let's go! What trends are you seeing in the extranet for this upcoming quarter?”</w:t>
+        <w:t xml:space="preserve">“Good afternoon, Mei. Yes, let's go! What trends do you see in the extranet for this upcoming quarter?”</w:t>
       </w:r>
     </w:p>
     <w:p>
@@ -933,7 +933,7 @@
           <w:sz w:val="20"/>
           <w:szCs w:val="20"/>
         </w:rPr>
-        <w:t xml:space="preserve">“Hi Priya, great to connect with you again! How have things been running at the property lately?”</w:t>
+        <w:t xml:space="preserve">“Hello Priya. Following up on our last discussion, our local account manager confirmed that your distribution team successfully aligned the rates for Oceanfront Bliss Lodge. While the trial delivered positive results, we still see an opportunity to optimize its conversion.”</w:t>
       </w:r>
     </w:p>
     <w:p>
@@ -964,7 +964,7 @@
           <w:sz w:val="20"/>
           <w:szCs w:val="20"/>
         </w:rPr>
-        <w:t xml:space="preserve">“Hey Kai! Busy as always, honestly. We've been really focused on some marketing campaigns and going over our internal reports. Things look ok on our end, so I'm curious to see what you wanted to run through today!”</w:t>
+        <w:t xml:space="preserve">“Hey Kai! We've been super focused on some marketing campaigns and looking over our internal reports. Things look ok on our end, so I'm curious to see what you wanted to run through today!”</w:t>
       </w:r>
     </w:p>
     <w:p>
@@ -1073,7 +1073,7 @@
           <w:sz w:val="20"/>
           <w:szCs w:val="20"/>
         </w:rPr>
-        <w:t xml:space="preserve">“Good afternoon, Ethan. Thanks for taking the time to connect. I'd love to review your performance together for the upcoming quarter.”</w:t>
+        <w:t xml:space="preserve">“Now that we have reviewed your regional portfolio performance for the upcoming quarter, shall we take a look at the data together on how Palace Grand Resort is performing based on our last conversation?”</w:t>
       </w:r>
     </w:p>
     <w:p>
@@ -1104,7 +1104,7 @@
           <w:sz w:val="20"/>
           <w:szCs w:val="20"/>
         </w:rPr>
-        <w:t xml:space="preserve">“Good afternoon, Diego. Yes, I have our PMS open. But to be frank, I'm still dealing with a lot of noise from other OTAs complaining about price competitiveness, even though I give everyone the exact same rate. That really bothers me given the operational effort it takes. I hope you're not bringing the same thing here...”</w:t>
+        <w:t xml:space="preserve">“Sure, Diego. I have our PMS open. However, to be frank, I'm still dealing with a lot of noise from other OTAs complaining about price competitiveness, even though I provide everyone the exact same rate. That is really bothering me considering the operational effort I have to deal with everyday. By the way, I hope you are not bringing the same thing here...”</w:t>
       </w:r>
     </w:p>
     <w:p>
@@ -1213,7 +1213,7 @@
           <w:sz w:val="20"/>
           <w:szCs w:val="20"/>
         </w:rPr>
-        <w:t xml:space="preserve">“Good morning, Claire. It's a pleasure speaking with you again. I hope you've had a productive week.”</w:t>
+        <w:t xml:space="preserve">“Good morning, Claire. Great to speak with you again. Last time when we discussed the Hidden Valley Resort during the portfolio review, you said you needed some time to reconsider our pricing recommendations. How have things been so far?”</w:t>
       </w:r>
     </w:p>
     <w:p>
@@ -1244,7 +1244,7 @@
           <w:sz w:val="20"/>
           <w:szCs w:val="20"/>
         </w:rPr>
-        <w:t xml:space="preserve">“Good morning, Oliver. Yes, things are going very well, thank you. Based on our agenda today, I understand we're reviewing our performance for the upcoming quarter.”</w:t>
+        <w:t xml:space="preserve">“Good morning, Oliver. Things are going very well, thank you. Based on our scheduled agenda today, I understand we are reviewing our performance for the upcoming quarter.”</w:t>
       </w:r>
     </w:p>
     <w:p>
@@ -1353,7 +1353,7 @@
           <w:sz w:val="20"/>
           <w:szCs w:val="20"/>
         </w:rPr>
-        <w:t xml:space="preserve">“Hi Lucas, thanks for taking the time to connect today. I'd love to review your performance together for the upcoming quarter. How's your schedule looking for a brief discussion?”</w:t>
+        <w:t xml:space="preserve">“Hi Lucas, thanks for taking the time today. Overall, your portfolio's market presence is looking healthy across the region. That being said, Loft Living Inn is still losing out on conversion this quarter. I want to walk you through what we're seeing there so we can improve the situation.”</w:t>
       </w:r>
     </w:p>
     <w:p>
@@ -1384,7 +1384,7 @@
           <w:sz w:val="20"/>
           <w:szCs w:val="20"/>
         </w:rPr>
-        <w:t xml:space="preserve">“Hello, Elena. I'm ready, thanks! To be completely honest, I'm still struggling with those wholesale rates ending up online as B2C offers. What does your internal data show us right now?”</w:t>
+        <w:t xml:space="preserve">“Hello, Elena. To be completely honest, I'm still struggling with those wholesale rates ending up online as B2C offers. What do your internal data show us right now?”</w:t>
       </w:r>
     </w:p>
     <w:p>
@@ -1493,7 +1493,7 @@
           <w:sz w:val="20"/>
           <w:szCs w:val="20"/>
         </w:rPr>
-        <w:t xml:space="preserve">“Good morning, Adam. Thanks for taking the time to reconnect today. Why don't we go straight to the data together?”</w:t>
+        <w:t xml:space="preserve">“Good morning, Adam. Following up on our last discussion regarding The Noble Falcon Inn, I know we ended on your risk-mitigation concerns around family room settings. Today I would like to zoom into this property's performance over the next quarter. Shall we go straight into reviewing the data together?”</w:t>
       </w:r>
     </w:p>
     <w:p>

</xml_diff>